<commit_message>
auto(daily): dev loop report 2026-05-30
</commit_message>
<xml_diff>
--- a/reports/hypothesis/2026-05-30.docx
+++ b/reports/hypothesis/2026-05-30.docx
@@ -15,7 +15,7 @@
         <w:rPr>
           <w:i/>
         </w:rPr>
-        <w:t>생성일: 2026-05-30 10:04 KST  |  표본: 측정소당 최소 2125건 / 총 10800건</w:t>
+        <w:t>생성일: 2026-05-30 10:24 KST  |  표본: 측정소당 최소 2126건 / 총 10805건</w:t>
       </w:r>
     </w:p>
     <w:p>
@@ -143,7 +143,7 @@
           </w:tcPr>
           <w:p>
             <w:r>
-              <w:t>38.463</w:t>
+              <w:t>38.468</w:t>
             </w:r>
           </w:p>
         </w:tc>
@@ -153,7 +153,7 @@
           </w:tcPr>
           <w:p>
             <w:r>
-              <w:t>34.401</w:t>
+              <w:t>34.397</w:t>
             </w:r>
           </w:p>
         </w:tc>
@@ -163,7 +163,7 @@
           </w:tcPr>
           <w:p>
             <w:r>
-              <w:t>+4.062</w:t>
+              <w:t>+4.070</w:t>
             </w:r>
           </w:p>
         </w:tc>
@@ -215,7 +215,7 @@
           </w:tcPr>
           <w:p>
             <w:r>
-              <w:t>21.417</w:t>
+              <w:t>21.418</w:t>
             </w:r>
           </w:p>
         </w:tc>
@@ -225,7 +225,7 @@
           </w:tcPr>
           <w:p>
             <w:r>
-              <w:t>17.806</w:t>
+              <w:t>17.807</w:t>
             </w:r>
           </w:p>
         </w:tc>
@@ -235,7 +235,7 @@
           </w:tcPr>
           <w:p>
             <w:r>
-              <w:t>+3.612</w:t>
+              <w:t>+3.611</w:t>
             </w:r>
           </w:p>
         </w:tc>
@@ -481,7 +481,7 @@
           </w:tcPr>
           <w:p>
             <w:r>
-              <w:t>+0.21 (작음)</w:t>
+              <w:t>+0.20 (작음)</w:t>
             </w:r>
           </w:p>
         </w:tc>
@@ -660,7 +660,7 @@
           </w:tcPr>
           <w:p>
             <w:r>
-              <w:t>33.27</w:t>
+              <w:t>33.52</w:t>
             </w:r>
           </w:p>
         </w:tc>
@@ -722,7 +722,7 @@
           </w:tcPr>
           <w:p>
             <w:r>
-              <w:t>73.70</w:t>
+              <w:t>73.76</w:t>
             </w:r>
           </w:p>
         </w:tc>
@@ -784,7 +784,7 @@
           </w:tcPr>
           <w:p>
             <w:r>
-              <w:t>19.47</w:t>
+              <w:t>19.44</w:t>
             </w:r>
           </w:p>
         </w:tc>
@@ -846,7 +846,7 @@
           </w:tcPr>
           <w:p>
             <w:r>
-              <w:t>133.68</w:t>
+              <w:t>133.83</w:t>
             </w:r>
           </w:p>
         </w:tc>
@@ -908,7 +908,7 @@
           </w:tcPr>
           <w:p>
             <w:r>
-              <w:t>73.71</w:t>
+              <w:t>73.60</w:t>
             </w:r>
           </w:p>
         </w:tc>
@@ -970,7 +970,7 @@
           </w:tcPr>
           <w:p>
             <w:r>
-              <w:t>147.82</w:t>
+              <w:t>147.89</w:t>
             </w:r>
           </w:p>
         </w:tc>

</xml_diff>